<commit_message>
Rough week 1 activities
</commit_message>
<xml_diff>
--- a/TO DO/Project Report.docx
+++ b/TO DO/Project Report.docx
@@ -301,7 +301,13 @@
               <w:tab w:val="right" w:leader="dot" w:pos="9016"/>
             </w:tabs>
             <w:rPr>
+              <w:rFonts w:asciiTheme="minorHAnsi" w:eastAsiaTheme="minorEastAsia" w:hAnsiTheme="minorHAnsi" w:cstheme="minorBidi"/>
               <w:noProof/>
+              <w:kern w:val="2"/>
+              <w:sz w:val="24"/>
+              <w:szCs w:val="24"/>
+              <w:lang w:eastAsia="en-AU"/>
+              <w14:ligatures w14:val="standardContextual"/>
             </w:rPr>
           </w:pPr>
           <w:r>
@@ -313,7 +319,7 @@
           <w:r>
             <w:fldChar w:fldCharType="separate"/>
           </w:r>
-          <w:hyperlink w:anchor="_Toc236074832" w:history="1">
+          <w:hyperlink w:anchor="_Toc236076931" w:history="1">
             <w:r>
               <w:rPr>
                 <w:rStyle w:val="Hyperlink"/>
@@ -340,75 +346,7 @@
                 <w:noProof/>
                 <w:webHidden/>
               </w:rPr>
-              <w:instrText xml:space="preserve"> PAGEREF _Toc236074832 \h </w:instrText>
-            </w:r>
-            <w:r>
-              <w:rPr>
-                <w:noProof/>
-                <w:webHidden/>
-              </w:rPr>
-            </w:r>
-            <w:r>
-              <w:rPr>
-                <w:noProof/>
-                <w:webHidden/>
-              </w:rPr>
-              <w:fldChar w:fldCharType="separate"/>
-            </w:r>
-            <w:r>
-              <w:rPr>
-                <w:noProof/>
-                <w:webHidden/>
-              </w:rPr>
-              <w:t>3</w:t>
-            </w:r>
-            <w:r>
-              <w:rPr>
-                <w:noProof/>
-                <w:webHidden/>
-              </w:rPr>
-              <w:fldChar w:fldCharType="end"/>
-            </w:r>
-          </w:hyperlink>
-        </w:p>
-        <w:p>
-          <w:pPr>
-            <w:pStyle w:val="TOC2"/>
-            <w:tabs>
-              <w:tab w:val="right" w:leader="dot" w:pos="9016"/>
-            </w:tabs>
-            <w:rPr>
-              <w:noProof/>
-            </w:rPr>
-          </w:pPr>
-          <w:hyperlink w:anchor="_Toc236074833" w:history="1">
-            <w:r>
-              <w:rPr>
-                <w:rStyle w:val="Hyperlink"/>
-                <w:noProof/>
-              </w:rPr>
-              <w:t>Requirements</w:t>
-            </w:r>
-            <w:r>
-              <w:rPr>
-                <w:noProof/>
-                <w:webHidden/>
-              </w:rPr>
-              <w:tab/>
-            </w:r>
-            <w:r>
-              <w:rPr>
-                <w:noProof/>
-                <w:webHidden/>
-              </w:rPr>
-              <w:fldChar w:fldCharType="begin"/>
-            </w:r>
-            <w:r>
-              <w:rPr>
-                <w:noProof/>
-                <w:webHidden/>
-              </w:rPr>
-              <w:instrText xml:space="preserve"> PAGEREF _Toc236074833 \h </w:instrText>
+              <w:instrText xml:space="preserve"> PAGEREF _Toc236076931 \h </w:instrText>
             </w:r>
             <w:r>
               <w:rPr>
@@ -446,16 +384,22 @@
               <w:tab w:val="right" w:leader="dot" w:pos="9016"/>
             </w:tabs>
             <w:rPr>
+              <w:rFonts w:asciiTheme="minorHAnsi" w:eastAsiaTheme="minorEastAsia" w:hAnsiTheme="minorHAnsi" w:cstheme="minorBidi"/>
               <w:noProof/>
+              <w:kern w:val="2"/>
+              <w:sz w:val="24"/>
+              <w:szCs w:val="24"/>
+              <w:lang w:eastAsia="en-AU"/>
+              <w14:ligatures w14:val="standardContextual"/>
             </w:rPr>
           </w:pPr>
-          <w:hyperlink w:anchor="_Toc236074834" w:history="1">
+          <w:hyperlink w:anchor="_Toc236076932" w:history="1">
             <w:r>
               <w:rPr>
                 <w:rStyle w:val="Hyperlink"/>
                 <w:noProof/>
               </w:rPr>
-              <w:t>Functional Requirements</w:t>
+              <w:t>Assumptions</w:t>
             </w:r>
             <w:r>
               <w:rPr>
@@ -476,7 +420,7 @@
                 <w:noProof/>
                 <w:webHidden/>
               </w:rPr>
-              <w:instrText xml:space="preserve"> PAGEREF _Toc236074834 \h </w:instrText>
+              <w:instrText xml:space="preserve"> PAGEREF _Toc236076932 \h </w:instrText>
             </w:r>
             <w:r>
               <w:rPr>
@@ -514,16 +458,22 @@
               <w:tab w:val="right" w:leader="dot" w:pos="9016"/>
             </w:tabs>
             <w:rPr>
+              <w:rFonts w:asciiTheme="minorHAnsi" w:eastAsiaTheme="minorEastAsia" w:hAnsiTheme="minorHAnsi" w:cstheme="minorBidi"/>
               <w:noProof/>
+              <w:kern w:val="2"/>
+              <w:sz w:val="24"/>
+              <w:szCs w:val="24"/>
+              <w:lang w:eastAsia="en-AU"/>
+              <w14:ligatures w14:val="standardContextual"/>
             </w:rPr>
           </w:pPr>
-          <w:hyperlink w:anchor="_Toc236074835" w:history="1">
+          <w:hyperlink w:anchor="_Toc236076933" w:history="1">
             <w:r>
               <w:rPr>
                 <w:rStyle w:val="Hyperlink"/>
                 <w:noProof/>
               </w:rPr>
-              <w:t>Nonfunctional Requirements</w:t>
+              <w:t>Constraints</w:t>
             </w:r>
             <w:r>
               <w:rPr>
@@ -544,7 +494,7 @@
                 <w:noProof/>
                 <w:webHidden/>
               </w:rPr>
-              <w:instrText xml:space="preserve"> PAGEREF _Toc236074835 \h </w:instrText>
+              <w:instrText xml:space="preserve"> PAGEREF _Toc236076933 \h </w:instrText>
             </w:r>
             <w:r>
               <w:rPr>
@@ -577,21 +527,27 @@
         </w:p>
         <w:p>
           <w:pPr>
-            <w:pStyle w:val="TOC2"/>
+            <w:pStyle w:val="TOC1"/>
             <w:tabs>
               <w:tab w:val="right" w:leader="dot" w:pos="9016"/>
             </w:tabs>
             <w:rPr>
+              <w:rFonts w:asciiTheme="minorHAnsi" w:eastAsiaTheme="minorEastAsia" w:hAnsiTheme="minorHAnsi" w:cstheme="minorBidi"/>
               <w:noProof/>
+              <w:kern w:val="2"/>
+              <w:sz w:val="24"/>
+              <w:szCs w:val="24"/>
+              <w:lang w:eastAsia="en-AU"/>
+              <w14:ligatures w14:val="standardContextual"/>
             </w:rPr>
           </w:pPr>
-          <w:hyperlink w:anchor="_Toc236074836" w:history="1">
+          <w:hyperlink w:anchor="_Toc236076934" w:history="1">
             <w:r>
               <w:rPr>
                 <w:rStyle w:val="Hyperlink"/>
                 <w:noProof/>
               </w:rPr>
-              <w:t>Assumptions</w:t>
+              <w:t>Requirements</w:t>
             </w:r>
             <w:r>
               <w:rPr>
@@ -612,7 +568,7 @@
                 <w:noProof/>
                 <w:webHidden/>
               </w:rPr>
-              <w:instrText xml:space="preserve"> PAGEREF _Toc236074836 \h </w:instrText>
+              <w:instrText xml:space="preserve"> PAGEREF _Toc236076934 \h </w:instrText>
             </w:r>
             <w:r>
               <w:rPr>
@@ -645,21 +601,27 @@
         </w:p>
         <w:p>
           <w:pPr>
-            <w:pStyle w:val="TOC2"/>
+            <w:pStyle w:val="TOC3"/>
             <w:tabs>
               <w:tab w:val="right" w:leader="dot" w:pos="9016"/>
             </w:tabs>
             <w:rPr>
+              <w:rFonts w:asciiTheme="minorHAnsi" w:eastAsiaTheme="minorEastAsia" w:hAnsiTheme="minorHAnsi" w:cstheme="minorBidi"/>
               <w:noProof/>
+              <w:kern w:val="2"/>
+              <w:sz w:val="24"/>
+              <w:szCs w:val="24"/>
+              <w:lang w:eastAsia="en-AU"/>
+              <w14:ligatures w14:val="standardContextual"/>
             </w:rPr>
           </w:pPr>
-          <w:hyperlink w:anchor="_Toc236074837" w:history="1">
+          <w:hyperlink w:anchor="_Toc236076935" w:history="1">
             <w:r>
               <w:rPr>
                 <w:rStyle w:val="Hyperlink"/>
                 <w:noProof/>
               </w:rPr>
-              <w:t>Constraints</w:t>
+              <w:t>Functional Requirements</w:t>
             </w:r>
             <w:r>
               <w:rPr>
@@ -680,7 +642,7 @@
                 <w:noProof/>
                 <w:webHidden/>
               </w:rPr>
-              <w:instrText xml:space="preserve"> PAGEREF _Toc236074837 \h </w:instrText>
+              <w:instrText xml:space="preserve"> PAGEREF _Toc236076935 \h </w:instrText>
             </w:r>
             <w:r>
               <w:rPr>
@@ -701,6 +663,302 @@
                 <w:webHidden/>
               </w:rPr>
               <w:t>4</w:t>
+            </w:r>
+            <w:r>
+              <w:rPr>
+                <w:noProof/>
+                <w:webHidden/>
+              </w:rPr>
+              <w:fldChar w:fldCharType="end"/>
+            </w:r>
+          </w:hyperlink>
+        </w:p>
+        <w:p>
+          <w:pPr>
+            <w:pStyle w:val="TOC3"/>
+            <w:tabs>
+              <w:tab w:val="right" w:leader="dot" w:pos="9016"/>
+            </w:tabs>
+            <w:rPr>
+              <w:rFonts w:asciiTheme="minorHAnsi" w:eastAsiaTheme="minorEastAsia" w:hAnsiTheme="minorHAnsi" w:cstheme="minorBidi"/>
+              <w:noProof/>
+              <w:kern w:val="2"/>
+              <w:sz w:val="24"/>
+              <w:szCs w:val="24"/>
+              <w:lang w:eastAsia="en-AU"/>
+              <w14:ligatures w14:val="standardContextual"/>
+            </w:rPr>
+          </w:pPr>
+          <w:hyperlink w:anchor="_Toc236076936" w:history="1">
+            <w:r>
+              <w:rPr>
+                <w:rStyle w:val="Hyperlink"/>
+                <w:noProof/>
+              </w:rPr>
+              <w:t>Nonfunctional Requirements</w:t>
+            </w:r>
+            <w:r>
+              <w:rPr>
+                <w:noProof/>
+                <w:webHidden/>
+              </w:rPr>
+              <w:tab/>
+            </w:r>
+            <w:r>
+              <w:rPr>
+                <w:noProof/>
+                <w:webHidden/>
+              </w:rPr>
+              <w:fldChar w:fldCharType="begin"/>
+            </w:r>
+            <w:r>
+              <w:rPr>
+                <w:noProof/>
+                <w:webHidden/>
+              </w:rPr>
+              <w:instrText xml:space="preserve"> PAGEREF _Toc236076936 \h </w:instrText>
+            </w:r>
+            <w:r>
+              <w:rPr>
+                <w:noProof/>
+                <w:webHidden/>
+              </w:rPr>
+            </w:r>
+            <w:r>
+              <w:rPr>
+                <w:noProof/>
+                <w:webHidden/>
+              </w:rPr>
+              <w:fldChar w:fldCharType="separate"/>
+            </w:r>
+            <w:r>
+              <w:rPr>
+                <w:noProof/>
+                <w:webHidden/>
+              </w:rPr>
+              <w:t>4</w:t>
+            </w:r>
+            <w:r>
+              <w:rPr>
+                <w:noProof/>
+                <w:webHidden/>
+              </w:rPr>
+              <w:fldChar w:fldCharType="end"/>
+            </w:r>
+          </w:hyperlink>
+        </w:p>
+        <w:p>
+          <w:pPr>
+            <w:pStyle w:val="TOC1"/>
+            <w:tabs>
+              <w:tab w:val="right" w:leader="dot" w:pos="9016"/>
+            </w:tabs>
+            <w:rPr>
+              <w:rFonts w:asciiTheme="minorHAnsi" w:eastAsiaTheme="minorEastAsia" w:hAnsiTheme="minorHAnsi" w:cstheme="minorBidi"/>
+              <w:noProof/>
+              <w:kern w:val="2"/>
+              <w:sz w:val="24"/>
+              <w:szCs w:val="24"/>
+              <w:lang w:eastAsia="en-AU"/>
+              <w14:ligatures w14:val="standardContextual"/>
+            </w:rPr>
+          </w:pPr>
+          <w:hyperlink w:anchor="_Toc236076937" w:history="1">
+            <w:r>
+              <w:rPr>
+                <w:rStyle w:val="Hyperlink"/>
+                <w:noProof/>
+              </w:rPr>
+              <w:t>Use Case Diagram</w:t>
+            </w:r>
+            <w:r>
+              <w:rPr>
+                <w:noProof/>
+                <w:webHidden/>
+              </w:rPr>
+              <w:tab/>
+            </w:r>
+            <w:r>
+              <w:rPr>
+                <w:noProof/>
+                <w:webHidden/>
+              </w:rPr>
+              <w:fldChar w:fldCharType="begin"/>
+            </w:r>
+            <w:r>
+              <w:rPr>
+                <w:noProof/>
+                <w:webHidden/>
+              </w:rPr>
+              <w:instrText xml:space="preserve"> PAGEREF _Toc236076937 \h </w:instrText>
+            </w:r>
+            <w:r>
+              <w:rPr>
+                <w:noProof/>
+                <w:webHidden/>
+              </w:rPr>
+            </w:r>
+            <w:r>
+              <w:rPr>
+                <w:noProof/>
+                <w:webHidden/>
+              </w:rPr>
+              <w:fldChar w:fldCharType="separate"/>
+            </w:r>
+            <w:r>
+              <w:rPr>
+                <w:noProof/>
+                <w:webHidden/>
+              </w:rPr>
+              <w:t>5</w:t>
+            </w:r>
+            <w:r>
+              <w:rPr>
+                <w:noProof/>
+                <w:webHidden/>
+              </w:rPr>
+              <w:fldChar w:fldCharType="end"/>
+            </w:r>
+          </w:hyperlink>
+        </w:p>
+        <w:p>
+          <w:pPr>
+            <w:pStyle w:val="TOC1"/>
+            <w:tabs>
+              <w:tab w:val="right" w:leader="dot" w:pos="9016"/>
+            </w:tabs>
+            <w:rPr>
+              <w:rFonts w:asciiTheme="minorHAnsi" w:eastAsiaTheme="minorEastAsia" w:hAnsiTheme="minorHAnsi" w:cstheme="minorBidi"/>
+              <w:noProof/>
+              <w:kern w:val="2"/>
+              <w:sz w:val="24"/>
+              <w:szCs w:val="24"/>
+              <w:lang w:eastAsia="en-AU"/>
+              <w14:ligatures w14:val="standardContextual"/>
+            </w:rPr>
+          </w:pPr>
+          <w:hyperlink w:anchor="_Toc236076938" w:history="1">
+            <w:r>
+              <w:rPr>
+                <w:rStyle w:val="Hyperlink"/>
+                <w:noProof/>
+              </w:rPr>
+              <w:t>Subsystems</w:t>
+            </w:r>
+            <w:r>
+              <w:rPr>
+                <w:noProof/>
+                <w:webHidden/>
+              </w:rPr>
+              <w:tab/>
+            </w:r>
+            <w:r>
+              <w:rPr>
+                <w:noProof/>
+                <w:webHidden/>
+              </w:rPr>
+              <w:fldChar w:fldCharType="begin"/>
+            </w:r>
+            <w:r>
+              <w:rPr>
+                <w:noProof/>
+                <w:webHidden/>
+              </w:rPr>
+              <w:instrText xml:space="preserve"> PAGEREF _Toc236076938 \h </w:instrText>
+            </w:r>
+            <w:r>
+              <w:rPr>
+                <w:noProof/>
+                <w:webHidden/>
+              </w:rPr>
+            </w:r>
+            <w:r>
+              <w:rPr>
+                <w:noProof/>
+                <w:webHidden/>
+              </w:rPr>
+              <w:fldChar w:fldCharType="separate"/>
+            </w:r>
+            <w:r>
+              <w:rPr>
+                <w:noProof/>
+                <w:webHidden/>
+              </w:rPr>
+              <w:t>6</w:t>
+            </w:r>
+            <w:r>
+              <w:rPr>
+                <w:noProof/>
+                <w:webHidden/>
+              </w:rPr>
+              <w:fldChar w:fldCharType="end"/>
+            </w:r>
+          </w:hyperlink>
+        </w:p>
+        <w:p>
+          <w:pPr>
+            <w:pStyle w:val="TOC1"/>
+            <w:tabs>
+              <w:tab w:val="right" w:leader="dot" w:pos="9016"/>
+            </w:tabs>
+            <w:rPr>
+              <w:rFonts w:asciiTheme="minorHAnsi" w:eastAsiaTheme="minorEastAsia" w:hAnsiTheme="minorHAnsi" w:cstheme="minorBidi"/>
+              <w:noProof/>
+              <w:kern w:val="2"/>
+              <w:sz w:val="24"/>
+              <w:szCs w:val="24"/>
+              <w:lang w:eastAsia="en-AU"/>
+              <w14:ligatures w14:val="standardContextual"/>
+            </w:rPr>
+          </w:pPr>
+          <w:hyperlink w:anchor="_Toc236076939" w:history="1">
+            <w:r>
+              <w:rPr>
+                <w:rStyle w:val="Hyperlink"/>
+                <w:noProof/>
+              </w:rPr>
+              <w:t>External Entities</w:t>
+            </w:r>
+            <w:r>
+              <w:rPr>
+                <w:noProof/>
+                <w:webHidden/>
+              </w:rPr>
+              <w:tab/>
+            </w:r>
+            <w:r>
+              <w:rPr>
+                <w:noProof/>
+                <w:webHidden/>
+              </w:rPr>
+              <w:fldChar w:fldCharType="begin"/>
+            </w:r>
+            <w:r>
+              <w:rPr>
+                <w:noProof/>
+                <w:webHidden/>
+              </w:rPr>
+              <w:instrText xml:space="preserve"> PAGEREF _Toc236076939 \h </w:instrText>
+            </w:r>
+            <w:r>
+              <w:rPr>
+                <w:noProof/>
+                <w:webHidden/>
+              </w:rPr>
+            </w:r>
+            <w:r>
+              <w:rPr>
+                <w:noProof/>
+                <w:webHidden/>
+              </w:rPr>
+              <w:fldChar w:fldCharType="separate"/>
+            </w:r>
+            <w:r>
+              <w:rPr>
+                <w:noProof/>
+                <w:webHidden/>
+              </w:rPr>
+              <w:t>6</w:t>
             </w:r>
             <w:r>
               <w:rPr>
@@ -735,7 +993,7 @@
       <w:pPr>
         <w:pStyle w:val="Heading1"/>
       </w:pPr>
-      <w:bookmarkStart w:id="0" w:name="_Toc236074832"/>
+      <w:bookmarkStart w:id="0" w:name="_Toc236076931"/>
       <w:r>
         <w:lastRenderedPageBreak/>
         <w:t>Project Scope</w:t>
@@ -749,17 +1007,175 @@
       <w:r>
         <w:t>a smart enterprise mobile application that generates personalised meal plans based on user health goals, dietary restrictions, and available ingredients. The system will use Generative AI to produce recipes, nutrition insights, and grocery lists.</w:t>
       </w:r>
+      <w:r>
+        <w:t xml:space="preserve"> </w:t>
+      </w:r>
     </w:p>
     <w:p/>
     <w:p>
       <w:pPr>
-        <w:pStyle w:val="Heading2"/>
-      </w:pPr>
-      <w:bookmarkStart w:id="1" w:name="_Toc236074833"/>
-      <w:r>
+        <w:pStyle w:val="Heading3"/>
+      </w:pPr>
+      <w:bookmarkStart w:id="1" w:name="_Toc236076932"/>
+      <w:r>
+        <w:t>Assumptions</w:t>
+      </w:r>
+      <w:bookmarkEnd w:id="1"/>
+    </w:p>
+    <w:p>
+      <w:pPr>
+        <w:pStyle w:val="ListParagraph"/>
+        <w:numPr>
+          <w:ilvl w:val="0"/>
+          <w:numId w:val="15"/>
+        </w:numPr>
+      </w:pPr>
+      <w:r>
+        <w:t>GenAI tools remain available throughout development</w:t>
+      </w:r>
+    </w:p>
+    <w:p>
+      <w:pPr>
+        <w:pStyle w:val="ListParagraph"/>
+        <w:numPr>
+          <w:ilvl w:val="0"/>
+          <w:numId w:val="15"/>
+        </w:numPr>
+      </w:pPr>
+      <w:r>
+        <w:t>Public nutrition datasets are accessible</w:t>
+      </w:r>
+    </w:p>
+    <w:p>
+      <w:pPr>
+        <w:pStyle w:val="ListParagraph"/>
+        <w:numPr>
+          <w:ilvl w:val="0"/>
+          <w:numId w:val="15"/>
+        </w:numPr>
+      </w:pPr>
+      <w:r>
+        <w:t>Users provide accurate dietary information</w:t>
+      </w:r>
+    </w:p>
+    <w:p>
+      <w:pPr>
+        <w:pStyle w:val="ListParagraph"/>
+        <w:numPr>
+          <w:ilvl w:val="0"/>
+          <w:numId w:val="15"/>
+        </w:numPr>
+      </w:pPr>
+      <w:r>
+        <w:t>Prototype will run on standard mobile devices.</w:t>
+      </w:r>
+    </w:p>
+    <w:p>
+      <w:pPr>
+        <w:pStyle w:val="ListParagraph"/>
+        <w:numPr>
+          <w:ilvl w:val="0"/>
+          <w:numId w:val="15"/>
+        </w:numPr>
+      </w:pPr>
+      <w:r>
+        <w:t>Internet access is available for AI features.</w:t>
+      </w:r>
+    </w:p>
+    <w:p/>
+    <w:p>
+      <w:pPr>
+        <w:pStyle w:val="Heading3"/>
+      </w:pPr>
+      <w:bookmarkStart w:id="2" w:name="_Toc236076933"/>
+      <w:r>
+        <w:t>Constraints</w:t>
+      </w:r>
+      <w:bookmarkEnd w:id="2"/>
+    </w:p>
+    <w:p>
+      <w:pPr>
+        <w:pStyle w:val="ListParagraph"/>
+        <w:numPr>
+          <w:ilvl w:val="0"/>
+          <w:numId w:val="16"/>
+        </w:numPr>
+      </w:pPr>
+      <w:r>
+        <w:t xml:space="preserve">Project must be completed within </w:t>
+      </w:r>
+      <w:r>
+        <w:t>term deadline</w:t>
+      </w:r>
+    </w:p>
+    <w:p>
+      <w:pPr>
+        <w:pStyle w:val="ListParagraph"/>
+        <w:numPr>
+          <w:ilvl w:val="0"/>
+          <w:numId w:val="16"/>
+        </w:numPr>
+      </w:pPr>
+      <w:r>
+        <w:t xml:space="preserve">Team size limited to </w:t>
+      </w:r>
+      <w:r>
+        <w:t>4</w:t>
+      </w:r>
+      <w:r>
+        <w:t xml:space="preserve"> members</w:t>
+      </w:r>
+    </w:p>
+    <w:p>
+      <w:pPr>
+        <w:pStyle w:val="ListParagraph"/>
+        <w:numPr>
+          <w:ilvl w:val="0"/>
+          <w:numId w:val="16"/>
+        </w:numPr>
+      </w:pPr>
+      <w:r>
+        <w:t>Only tools taught in prior units may be used</w:t>
+      </w:r>
+    </w:p>
+    <w:p>
+      <w:pPr>
+        <w:pStyle w:val="ListParagraph"/>
+        <w:numPr>
+          <w:ilvl w:val="0"/>
+          <w:numId w:val="16"/>
+        </w:numPr>
+      </w:pPr>
+      <w:r>
+        <w:t>Limited dataset size due to prototype scope</w:t>
+      </w:r>
+    </w:p>
+    <w:p/>
+    <w:p/>
+    <w:p>
+      <w:pPr>
+        <w:spacing w:after="160" w:line="259" w:lineRule="auto"/>
+        <w:rPr>
+          <w:rFonts w:asciiTheme="majorHAnsi" w:eastAsiaTheme="majorEastAsia" w:hAnsiTheme="majorHAnsi" w:cstheme="majorBidi"/>
+          <w:color w:val="0F4761" w:themeColor="accent1" w:themeShade="BF"/>
+          <w:sz w:val="40"/>
+          <w:szCs w:val="40"/>
+        </w:rPr>
+      </w:pPr>
+      <w:r>
+        <w:br w:type="page"/>
+      </w:r>
+    </w:p>
+    <w:p>
+      <w:pPr>
+        <w:pStyle w:val="Heading1"/>
+      </w:pPr>
+      <w:bookmarkStart w:id="3" w:name="_Toc236076934"/>
+      <w:r>
+        <w:lastRenderedPageBreak/>
         <w:t>Requirements</w:t>
       </w:r>
-      <w:bookmarkEnd w:id="1"/>
+      <w:bookmarkEnd w:id="3"/>
     </w:p>
     <w:p>
       <w:pPr>
@@ -770,17 +1186,57 @@
           <w:bCs w:val="0"/>
         </w:rPr>
       </w:pPr>
-      <w:bookmarkStart w:id="2" w:name="_Toc236074834"/>
+      <w:bookmarkStart w:id="4" w:name="_Toc236076935"/>
       <w:r>
         <w:t>Functional Requirements</w:t>
       </w:r>
-      <w:bookmarkEnd w:id="2"/>
+      <w:bookmarkEnd w:id="4"/>
     </w:p>
     <w:p>
       <w:pPr>
         <w:pStyle w:val="ListParagraph"/>
         <w:numPr>
           <w:ilvl w:val="0"/>
+          <w:numId w:val="13"/>
+        </w:numPr>
+        <w:rPr>
+          <w:rStyle w:val="Strong"/>
+          <w:rFonts w:eastAsia="Times New Roman"/>
+        </w:rPr>
+      </w:pPr>
+      <w:r>
+        <w:rPr>
+          <w:rStyle w:val="Strong"/>
+          <w:rFonts w:cs="Calibri"/>
+          <w:b w:val="0"/>
+          <w:bCs w:val="0"/>
+        </w:rPr>
+        <w:t xml:space="preserve">User Profile </w:t>
+      </w:r>
+      <w:r>
+        <w:rPr>
+          <w:rStyle w:val="Strong"/>
+          <w:rFonts w:cs="Calibri"/>
+          <w:b w:val="0"/>
+          <w:bCs w:val="0"/>
+        </w:rPr>
+        <w:t>and</w:t>
+      </w:r>
+      <w:r>
+        <w:rPr>
+          <w:rStyle w:val="Strong"/>
+          <w:rFonts w:cs="Calibri"/>
+          <w:b w:val="0"/>
+          <w:bCs w:val="0"/>
+        </w:rPr>
+        <w:t xml:space="preserve"> Preferences</w:t>
+      </w:r>
+    </w:p>
+    <w:p>
+      <w:pPr>
+        <w:pStyle w:val="ListParagraph"/>
+        <w:numPr>
+          <w:ilvl w:val="1"/>
           <w:numId w:val="13"/>
         </w:numPr>
         <w:rPr>
@@ -790,31 +1246,7 @@
         </w:rPr>
       </w:pPr>
       <w:r>
-        <w:rPr>
-          <w:rStyle w:val="Strong"/>
-          <w:rFonts w:cs="Calibri"/>
-          <w:b w:val="0"/>
-          <w:bCs w:val="0"/>
-        </w:rPr>
-        <w:t xml:space="preserve">User Profile </w:t>
-      </w:r>
-      <w:r>
-        <w:rPr>
-          <w:rStyle w:val="Strong"/>
-          <w:rFonts w:cs="Calibri"/>
-          <w:b w:val="0"/>
-          <w:bCs w:val="0"/>
-        </w:rPr>
-        <w:t>and</w:t>
-      </w:r>
-      <w:r>
-        <w:rPr>
-          <w:rStyle w:val="Strong"/>
-          <w:rFonts w:cs="Calibri"/>
-          <w:b w:val="0"/>
-          <w:bCs w:val="0"/>
-        </w:rPr>
-        <w:t xml:space="preserve"> Preferences</w:t>
+        <w:t>Capture health goals</w:t>
       </w:r>
     </w:p>
     <w:p>
@@ -824,9 +1256,17 @@
           <w:ilvl w:val="1"/>
           <w:numId w:val="13"/>
         </w:numPr>
-      </w:pPr>
-      <w:r>
-        <w:t>Health goals (weight loss, muscle gain, maintenance)</w:t>
+        <w:rPr>
+          <w:rFonts w:eastAsia="Times New Roman"/>
+          <w:b/>
+          <w:bCs/>
+        </w:rPr>
+      </w:pPr>
+      <w:r>
+        <w:t>C</w:t>
+      </w:r>
+      <w:r>
+        <w:t>apture dietary restrictions</w:t>
       </w:r>
     </w:p>
     <w:p>
@@ -836,21 +1276,14 @@
           <w:ilvl w:val="1"/>
           <w:numId w:val="13"/>
         </w:numPr>
-      </w:pPr>
-      <w:r>
-        <w:t>Dietary restrictions (vegan, keto, allergies)</w:t>
-      </w:r>
-    </w:p>
-    <w:p>
-      <w:pPr>
-        <w:pStyle w:val="ListParagraph"/>
-        <w:numPr>
-          <w:ilvl w:val="1"/>
-          <w:numId w:val="13"/>
-        </w:numPr>
-      </w:pPr>
-      <w:r>
-        <w:t>Ingredient availability</w:t>
+        <w:rPr>
+          <w:rFonts w:eastAsia="Times New Roman"/>
+          <w:b/>
+          <w:bCs/>
+        </w:rPr>
+      </w:pPr>
+      <w:r>
+        <w:t>Capture available ingredients</w:t>
       </w:r>
     </w:p>
     <w:p>
@@ -884,7 +1317,7 @@
         </w:numPr>
       </w:pPr>
       <w:r>
-        <w:t>Weekly personalised meal plans</w:t>
+        <w:t>Generate weekly personalised meal plans</w:t>
       </w:r>
     </w:p>
     <w:p>
@@ -896,7 +1329,7 @@
         </w:numPr>
       </w:pPr>
       <w:r>
-        <w:t>Adjustable portion sizes</w:t>
+        <w:t>Adjust portion sizes</w:t>
       </w:r>
     </w:p>
     <w:p>
@@ -930,7 +1363,7 @@
         </w:numPr>
       </w:pPr>
       <w:r>
-        <w:t>Recipes based on available ingredients</w:t>
+        <w:t>Generate recipes based on available ingredients</w:t>
       </w:r>
     </w:p>
     <w:p>
@@ -940,9 +1373,13 @@
           <w:ilvl w:val="1"/>
           <w:numId w:val="13"/>
         </w:numPr>
-      </w:pPr>
-      <w:r>
-        <w:t>Alternative ingredient suggestions</w:t>
+        <w:rPr>
+          <w:b/>
+          <w:bCs/>
+        </w:rPr>
+      </w:pPr>
+      <w:r>
+        <w:t>Suggest alternative ingredients</w:t>
       </w:r>
     </w:p>
     <w:p>
@@ -976,7 +1413,7 @@
         </w:numPr>
       </w:pPr>
       <w:r>
-        <w:t>Calorie breakdown</w:t>
+        <w:t>Calculate calorie breakdown</w:t>
       </w:r>
     </w:p>
     <w:p>
@@ -986,9 +1423,13 @@
           <w:ilvl w:val="1"/>
           <w:numId w:val="13"/>
         </w:numPr>
-      </w:pPr>
-      <w:r>
-        <w:t>Macro and micronutrient insights</w:t>
+        <w:rPr>
+          <w:b/>
+          <w:bCs/>
+        </w:rPr>
+      </w:pPr>
+      <w:r>
+        <w:t>Calculate macro and micronutrient insights</w:t>
       </w:r>
     </w:p>
     <w:p>
@@ -1022,11 +1463,7 @@
         </w:numPr>
       </w:pPr>
       <w:r>
-        <w:t>Auto</w:t>
-      </w:r>
-      <w:r>
-        <w:noBreakHyphen/>
-        <w:t>generated shopping lists</w:t>
+        <w:t>Generate shopping lists</w:t>
       </w:r>
     </w:p>
     <w:p>
@@ -1038,7 +1475,13 @@
         </w:numPr>
       </w:pPr>
       <w:r>
-        <w:t>Categorised items (produce, pantry, protein, etc.)</w:t>
+        <w:t>Categorise items</w:t>
+      </w:r>
+      <w:r>
+        <w:t xml:space="preserve"> </w:t>
+      </w:r>
+      <w:r>
+        <w:t>(produce, pantry, protein, etc.)</w:t>
       </w:r>
     </w:p>
     <w:p>
@@ -1048,19 +1491,12 @@
           <w:ilvl w:val="0"/>
           <w:numId w:val="13"/>
         </w:numPr>
+      </w:pPr>
+      <w:r>
         <w:rPr>
-          <w:b/>
-          <w:bCs/>
+          <w:rFonts w:cs="Calibri"/>
         </w:rPr>
-      </w:pPr>
-      <w:r>
-        <w:rPr>
-          <w:rStyle w:val="Strong"/>
-          <w:rFonts w:cs="Calibri"/>
-          <w:b w:val="0"/>
-          <w:bCs w:val="0"/>
-        </w:rPr>
-        <w:t>Mobile Application Interface</w:t>
+        <w:t>User Interaction</w:t>
       </w:r>
     </w:p>
     <w:p>
@@ -1070,9 +1506,12 @@
           <w:ilvl w:val="1"/>
           <w:numId w:val="13"/>
         </w:numPr>
-      </w:pPr>
-      <w:r>
-        <w:t>User-friendly UI</w:t>
+        <w:rPr>
+          <w:rFonts w:ascii="Times New Roman" w:eastAsia="Times New Roman" w:hAnsi="Times New Roman"/>
+        </w:rPr>
+      </w:pPr>
+      <w:r>
+        <w:t>Allow users to view meal plans</w:t>
       </w:r>
     </w:p>
     <w:p>
@@ -1084,22 +1523,34 @@
         </w:numPr>
       </w:pPr>
       <w:r>
-        <w:t>Simple navigation between meal plans, recipes, and grocery lists</w:t>
-      </w:r>
-      <w:bookmarkStart w:id="3" w:name="_Toc236074835"/>
+        <w:t>Allow users to view recipes</w:t>
+      </w:r>
+    </w:p>
+    <w:p>
+      <w:pPr>
+        <w:pStyle w:val="ListParagraph"/>
+        <w:numPr>
+          <w:ilvl w:val="1"/>
+          <w:numId w:val="13"/>
+        </w:numPr>
+      </w:pPr>
+      <w:r>
+        <w:t>Allow users to view grocery lists</w:t>
+      </w:r>
     </w:p>
     <w:p/>
     <w:p>
       <w:pPr>
         <w:pStyle w:val="Heading3"/>
       </w:pPr>
+      <w:bookmarkStart w:id="5" w:name="_Toc236076936"/>
       <w:r>
         <w:t>Nonf</w:t>
       </w:r>
       <w:r>
         <w:t>unctional Requirements</w:t>
       </w:r>
-      <w:bookmarkEnd w:id="3"/>
+      <w:bookmarkEnd w:id="5"/>
     </w:p>
     <w:p>
       <w:pPr>
@@ -1158,55 +1609,155 @@
         </w:numPr>
       </w:pPr>
       <w:r>
-        <w:t>Barcode scanning</w:t>
-      </w:r>
+        <w:t>Simple navigation</w:t>
+      </w:r>
+    </w:p>
+    <w:p>
+      <w:pPr>
+        <w:spacing w:after="160" w:line="259" w:lineRule="auto"/>
+      </w:pPr>
+      <w:r>
+        <w:br w:type="page"/>
+      </w:r>
+    </w:p>
+    <w:p>
+      <w:pPr>
+        <w:pStyle w:val="Heading1"/>
+      </w:pPr>
+      <w:bookmarkStart w:id="6" w:name="_Toc236076937"/>
+      <w:r>
+        <w:lastRenderedPageBreak/>
+        <w:t>Use Case Diagram</w:t>
+      </w:r>
+      <w:bookmarkEnd w:id="6"/>
+    </w:p>
+    <w:p>
+      <w:r>
+        <w:drawing>
+          <wp:inline distT="0" distB="0" distL="0" distR="0" wp14:anchorId="648329CA" wp14:editId="16E7178E">
+            <wp:extent cx="3035456" cy="7067913"/>
+            <wp:effectExtent l="0" t="0" r="0" b="0"/>
+            <wp:docPr id="721704795" name="Picture 1"/>
+            <wp:cNvGraphicFramePr>
+              <a:graphicFrameLocks xmlns:a="http://schemas.openxmlformats.org/drawingml/2006/main" noChangeAspect="1"/>
+            </wp:cNvGraphicFramePr>
+            <a:graphic xmlns:a="http://schemas.openxmlformats.org/drawingml/2006/main">
+              <a:graphicData uri="http://schemas.openxmlformats.org/drawingml/2006/picture">
+                <pic:pic xmlns:pic="http://schemas.openxmlformats.org/drawingml/2006/picture">
+                  <pic:nvPicPr>
+                    <pic:cNvPr id="721704795" name=""/>
+                    <pic:cNvPicPr/>
+                  </pic:nvPicPr>
+                  <pic:blipFill>
+                    <a:blip r:embed="rId5"/>
+                    <a:stretch>
+                      <a:fillRect/>
+                    </a:stretch>
+                  </pic:blipFill>
+                  <pic:spPr>
+                    <a:xfrm>
+                      <a:off x="0" y="0"/>
+                      <a:ext cx="3035456" cy="7067913"/>
+                    </a:xfrm>
+                    <a:prstGeom prst="rect">
+                      <a:avLst/>
+                    </a:prstGeom>
+                  </pic:spPr>
+                </pic:pic>
+              </a:graphicData>
+            </a:graphic>
+          </wp:inline>
+        </w:drawing>
+      </w:r>
+    </w:p>
+    <w:p/>
+    <w:p>
+      <w:pPr>
+        <w:spacing w:after="160" w:line="259" w:lineRule="auto"/>
+      </w:pPr>
+      <w:r>
+        <w:br w:type="page"/>
+      </w:r>
+    </w:p>
+    <w:p>
+      <w:pPr>
+        <w:pStyle w:val="Heading1"/>
+      </w:pPr>
+      <w:bookmarkStart w:id="7" w:name="_Toc236076938"/>
+      <w:r>
+        <w:lastRenderedPageBreak/>
+        <w:t>Subsystems</w:t>
+      </w:r>
+      <w:bookmarkEnd w:id="7"/>
     </w:p>
     <w:p>
       <w:pPr>
         <w:pStyle w:val="ListParagraph"/>
         <w:numPr>
           <w:ilvl w:val="0"/>
-          <w:numId w:val="13"/>
+          <w:numId w:val="19"/>
         </w:numPr>
-      </w:pPr>
-      <w:r>
-        <w:t>Multi</w:t>
-      </w:r>
-      <w:r>
-        <w:noBreakHyphen/>
-        <w:t>language support</w:t>
-      </w:r>
-    </w:p>
-    <w:p/>
-    <w:p>
-      <w:pPr>
-        <w:spacing w:after="160" w:line="259" w:lineRule="auto"/>
-      </w:pPr>
-      <w:r>
-        <w:br w:type="page"/>
-      </w:r>
-    </w:p>
-    <w:p>
-      <w:pPr>
-        <w:pStyle w:val="Heading3"/>
-      </w:pPr>
-      <w:bookmarkStart w:id="4" w:name="_Toc236074836"/>
-      <w:r>
-        <w:lastRenderedPageBreak/>
-        <w:t>Assumptions</w:t>
-      </w:r>
-      <w:bookmarkEnd w:id="4"/>
+        <w:rPr>
+          <w:rFonts w:ascii="Times New Roman" w:eastAsia="Times New Roman" w:hAnsi="Times New Roman"/>
+        </w:rPr>
+      </w:pPr>
+      <w:r>
+        <w:rPr>
+          <w:rStyle w:val="Strong"/>
+          <w:b w:val="0"/>
+          <w:bCs w:val="0"/>
+        </w:rPr>
+        <w:t>User Profile Manager</w:t>
+      </w:r>
+      <w:r>
+        <w:t xml:space="preserve"> </w:t>
+      </w:r>
+    </w:p>
+    <w:p>
+      <w:pPr>
+        <w:pStyle w:val="ListParagraph"/>
+        <w:numPr>
+          <w:ilvl w:val="1"/>
+          <w:numId w:val="19"/>
+        </w:numPr>
+        <w:rPr>
+          <w:rFonts w:ascii="Times New Roman" w:eastAsia="Times New Roman" w:hAnsi="Times New Roman"/>
+        </w:rPr>
+      </w:pPr>
+      <w:r>
+        <w:t>Handles health goals, dietary restrictions, ingredient availability.</w:t>
+      </w:r>
     </w:p>
     <w:p>
       <w:pPr>
         <w:pStyle w:val="ListParagraph"/>
         <w:numPr>
           <w:ilvl w:val="0"/>
-          <w:numId w:val="15"/>
+          <w:numId w:val="19"/>
         </w:numPr>
       </w:pPr>
       <w:r>
-        <w:t>GenAI tools remain available throughout development</w:t>
+        <w:rPr>
+          <w:rStyle w:val="Strong"/>
+          <w:b w:val="0"/>
+          <w:bCs w:val="0"/>
+        </w:rPr>
+        <w:t>Meal Plan Generator (AI)</w:t>
+      </w:r>
+      <w:r>
+        <w:t xml:space="preserve"> </w:t>
+      </w:r>
+    </w:p>
+    <w:p>
+      <w:pPr>
+        <w:pStyle w:val="ListParagraph"/>
+        <w:numPr>
+          <w:ilvl w:val="1"/>
+          <w:numId w:val="19"/>
+        </w:numPr>
+      </w:pPr>
+      <w:r>
+        <w:t>Generates personalised weekly meal plans.</w:t>
       </w:r>
     </w:p>
     <w:p>
@@ -1214,11 +1765,31 @@
         <w:pStyle w:val="ListParagraph"/>
         <w:numPr>
           <w:ilvl w:val="0"/>
-          <w:numId w:val="15"/>
+          <w:numId w:val="19"/>
         </w:numPr>
       </w:pPr>
       <w:r>
-        <w:t>Public nutrition datasets are accessible</w:t>
+        <w:rPr>
+          <w:rStyle w:val="Strong"/>
+          <w:b w:val="0"/>
+          <w:bCs w:val="0"/>
+        </w:rPr>
+        <w:t>Recipe Generator (AI)</w:t>
+      </w:r>
+      <w:r>
+        <w:t xml:space="preserve"> </w:t>
+      </w:r>
+    </w:p>
+    <w:p>
+      <w:pPr>
+        <w:pStyle w:val="ListParagraph"/>
+        <w:numPr>
+          <w:ilvl w:val="1"/>
+          <w:numId w:val="19"/>
+        </w:numPr>
+      </w:pPr>
+      <w:r>
+        <w:t>Produces recipes and alternative ingredient suggestions.</w:t>
       </w:r>
     </w:p>
     <w:p>
@@ -1226,37 +1797,63 @@
         <w:pStyle w:val="ListParagraph"/>
         <w:numPr>
           <w:ilvl w:val="0"/>
-          <w:numId w:val="15"/>
+          <w:numId w:val="19"/>
         </w:numPr>
       </w:pPr>
       <w:r>
-        <w:t>Prototype only</w:t>
-      </w:r>
-    </w:p>
-    <w:p/>
-    <w:p>
-      <w:pPr>
-        <w:pStyle w:val="Heading3"/>
-      </w:pPr>
-      <w:bookmarkStart w:id="5" w:name="_Toc236074837"/>
-      <w:r>
-        <w:t>Constraints</w:t>
-      </w:r>
-      <w:bookmarkEnd w:id="5"/>
+        <w:rPr>
+          <w:rStyle w:val="Strong"/>
+          <w:b w:val="0"/>
+          <w:bCs w:val="0"/>
+        </w:rPr>
+        <w:t>Nutrition Analysis Engine</w:t>
+      </w:r>
+      <w:r>
+        <w:t xml:space="preserve"> </w:t>
+      </w:r>
+    </w:p>
+    <w:p>
+      <w:pPr>
+        <w:pStyle w:val="ListParagraph"/>
+        <w:numPr>
+          <w:ilvl w:val="1"/>
+          <w:numId w:val="19"/>
+        </w:numPr>
+      </w:pPr>
+      <w:r>
+        <w:t>Calculates calories, macros, micronutrients.</w:t>
+      </w:r>
     </w:p>
     <w:p>
       <w:pPr>
         <w:pStyle w:val="ListParagraph"/>
         <w:numPr>
           <w:ilvl w:val="0"/>
-          <w:numId w:val="16"/>
+          <w:numId w:val="19"/>
         </w:numPr>
       </w:pPr>
       <w:r>
-        <w:t xml:space="preserve">Project must be completed within </w:t>
-      </w:r>
-      <w:r>
-        <w:t>allocated time</w:t>
+        <w:rPr>
+          <w:rStyle w:val="Strong"/>
+          <w:b w:val="0"/>
+          <w:bCs w:val="0"/>
+        </w:rPr>
+        <w:t>Grocery List Generator</w:t>
+      </w:r>
+      <w:r>
+        <w:t xml:space="preserve"> </w:t>
+      </w:r>
+    </w:p>
+    <w:p>
+      <w:pPr>
+        <w:pStyle w:val="ListParagraph"/>
+        <w:numPr>
+          <w:ilvl w:val="1"/>
+          <w:numId w:val="19"/>
+        </w:numPr>
+      </w:pPr>
+      <w:r>
+        <w:t>Creates categorised shopping lists.</w:t>
       </w:r>
     </w:p>
     <w:p>
@@ -1264,17 +1861,31 @@
         <w:pStyle w:val="ListParagraph"/>
         <w:numPr>
           <w:ilvl w:val="0"/>
-          <w:numId w:val="16"/>
+          <w:numId w:val="19"/>
         </w:numPr>
       </w:pPr>
       <w:r>
-        <w:t xml:space="preserve">Team size limited to </w:t>
-      </w:r>
-      <w:r>
-        <w:t>4</w:t>
-      </w:r>
-      <w:r>
-        <w:t xml:space="preserve"> members</w:t>
+        <w:rPr>
+          <w:rStyle w:val="Strong"/>
+          <w:b w:val="0"/>
+          <w:bCs w:val="0"/>
+        </w:rPr>
+        <w:t>Data Storage / Database</w:t>
+      </w:r>
+      <w:r>
+        <w:t xml:space="preserve"> </w:t>
+      </w:r>
+    </w:p>
+    <w:p>
+      <w:pPr>
+        <w:pStyle w:val="ListParagraph"/>
+        <w:numPr>
+          <w:ilvl w:val="1"/>
+          <w:numId w:val="19"/>
+        </w:numPr>
+      </w:pPr>
+      <w:r>
+        <w:t>Stores user profiles, ingredients, generated plans, recipes.</w:t>
       </w:r>
     </w:p>
     <w:p>
@@ -1282,18 +1893,189 @@
         <w:pStyle w:val="ListParagraph"/>
         <w:numPr>
           <w:ilvl w:val="0"/>
-          <w:numId w:val="16"/>
+          <w:numId w:val="19"/>
         </w:numPr>
       </w:pPr>
       <w:r>
-        <w:t xml:space="preserve">Must use </w:t>
-      </w:r>
-      <w:r>
-        <w:t>tools learnt in prior units</w:t>
+        <w:rPr>
+          <w:rStyle w:val="Strong"/>
+          <w:b w:val="0"/>
+          <w:bCs w:val="0"/>
+        </w:rPr>
+        <w:t>Mobile App Interface</w:t>
+      </w:r>
+      <w:r>
+        <w:t xml:space="preserve"> </w:t>
+      </w:r>
+    </w:p>
+    <w:p>
+      <w:pPr>
+        <w:pStyle w:val="ListParagraph"/>
+        <w:numPr>
+          <w:ilvl w:val="1"/>
+          <w:numId w:val="19"/>
+        </w:numPr>
+      </w:pPr>
+      <w:r>
+        <w:t>Frontend used by the client.</w:t>
       </w:r>
     </w:p>
     <w:p/>
+    <w:p>
+      <w:pPr>
+        <w:pStyle w:val="Heading2"/>
+      </w:pPr>
+      <w:bookmarkStart w:id="8" w:name="_Toc236076939"/>
+      <w:r>
+        <w:t>External Entities</w:t>
+      </w:r>
+      <w:bookmarkEnd w:id="8"/>
+    </w:p>
+    <w:p>
+      <w:pPr>
+        <w:pStyle w:val="ListParagraph"/>
+        <w:numPr>
+          <w:ilvl w:val="0"/>
+          <w:numId w:val="21"/>
+        </w:numPr>
+        <w:rPr>
+          <w:rFonts w:ascii="Times New Roman" w:eastAsia="Times New Roman" w:hAnsi="Times New Roman"/>
+        </w:rPr>
+      </w:pPr>
+      <w:r>
+        <w:rPr>
+          <w:rStyle w:val="Strong"/>
+          <w:b w:val="0"/>
+          <w:bCs w:val="0"/>
+        </w:rPr>
+        <w:t>User</w:t>
+      </w:r>
+      <w:r>
+        <w:rPr>
+          <w:b/>
+          <w:bCs/>
+        </w:rPr>
+        <w:t xml:space="preserve"> </w:t>
+      </w:r>
+      <w:r>
+        <w:t>(primary actor)</w:t>
+      </w:r>
+    </w:p>
+    <w:p>
+      <w:pPr>
+        <w:pStyle w:val="ListParagraph"/>
+        <w:numPr>
+          <w:ilvl w:val="0"/>
+          <w:numId w:val="21"/>
+        </w:numPr>
+      </w:pPr>
+      <w:r>
+        <w:rPr>
+          <w:rStyle w:val="Strong"/>
+          <w:b w:val="0"/>
+          <w:bCs w:val="0"/>
+        </w:rPr>
+        <w:t>GenAI API</w:t>
+      </w:r>
+      <w:r>
+        <w:t xml:space="preserve"> (external AI model generating meal plans/recipes)</w:t>
+      </w:r>
+    </w:p>
+    <w:p>
+      <w:pPr>
+        <w:pStyle w:val="ListParagraph"/>
+        <w:numPr>
+          <w:ilvl w:val="0"/>
+          <w:numId w:val="21"/>
+        </w:numPr>
+      </w:pPr>
+      <w:r>
+        <w:rPr>
+          <w:rStyle w:val="Strong"/>
+          <w:b w:val="0"/>
+          <w:bCs w:val="0"/>
+        </w:rPr>
+        <w:t>Public Nutrition Dataset</w:t>
+      </w:r>
+      <w:r>
+        <w:t xml:space="preserve"> (ingredient nutrition values)</w:t>
+      </w:r>
+    </w:p>
     <w:p/>
+    <w:p>
+      <w:pPr>
+        <w:pStyle w:val="Heading2"/>
+      </w:pPr>
+      <w:r>
+        <w:lastRenderedPageBreak/>
+        <w:t>Context Diagram</w:t>
+      </w:r>
+    </w:p>
+    <w:p>
+      <w:r>
+        <w:drawing>
+          <wp:inline distT="0" distB="0" distL="0" distR="0" wp14:anchorId="3ABEF54E" wp14:editId="46DBFE11">
+            <wp:extent cx="5731510" cy="4100195"/>
+            <wp:effectExtent l="0" t="0" r="2540" b="0"/>
+            <wp:docPr id="1766832844" name="Picture 1"/>
+            <wp:cNvGraphicFramePr>
+              <a:graphicFrameLocks xmlns:a="http://schemas.openxmlformats.org/drawingml/2006/main" noChangeAspect="1"/>
+            </wp:cNvGraphicFramePr>
+            <a:graphic xmlns:a="http://schemas.openxmlformats.org/drawingml/2006/main">
+              <a:graphicData uri="http://schemas.openxmlformats.org/drawingml/2006/picture">
+                <pic:pic xmlns:pic="http://schemas.openxmlformats.org/drawingml/2006/picture">
+                  <pic:nvPicPr>
+                    <pic:cNvPr id="1766832844" name=""/>
+                    <pic:cNvPicPr/>
+                  </pic:nvPicPr>
+                  <pic:blipFill>
+                    <a:blip r:embed="rId6"/>
+                    <a:stretch>
+                      <a:fillRect/>
+                    </a:stretch>
+                  </pic:blipFill>
+                  <pic:spPr>
+                    <a:xfrm>
+                      <a:off x="0" y="0"/>
+                      <a:ext cx="5731510" cy="4100195"/>
+                    </a:xfrm>
+                    <a:prstGeom prst="rect">
+                      <a:avLst/>
+                    </a:prstGeom>
+                  </pic:spPr>
+                </pic:pic>
+              </a:graphicData>
+            </a:graphic>
+          </wp:inline>
+        </w:drawing>
+      </w:r>
+    </w:p>
+    <w:p>
+      <w:pPr>
+        <w:spacing w:after="160" w:line="259" w:lineRule="auto"/>
+      </w:pPr>
+      <w:r>
+        <w:br w:type="page"/>
+      </w:r>
+    </w:p>
+    <w:p>
+      <w:pPr>
+        <w:pStyle w:val="Heading1"/>
+      </w:pPr>
+      <w:r>
+        <w:lastRenderedPageBreak/>
+        <w:t>S</w:t>
+      </w:r>
+      <w:r>
+        <w:t xml:space="preserve">oftware </w:t>
+      </w:r>
+      <w:r>
+        <w:t>C</w:t>
+      </w:r>
+      <w:r>
+        <w:t>omponents</w:t>
+      </w:r>
+    </w:p>
     <w:p/>
     <w:sectPr>
       <w:pgSz w:w="11906" w:h="16838"/>
@@ -2017,6 +2799,155 @@
     </w:lvl>
   </w:abstractNum>
   <w:abstractNum w:abstractNumId="5" w15:restartNumberingAfterBreak="0">
+    <w:nsid w:val="1797383A"/>
+    <w:multiLevelType w:val="multilevel"/>
+    <w:tmpl w:val="9DB25B08"/>
+    <w:lvl w:ilvl="0">
+      <w:start w:val="1"/>
+      <w:numFmt w:val="bullet"/>
+      <w:lvlText w:val=""/>
+      <w:lvlJc w:val="left"/>
+      <w:pPr>
+        <w:tabs>
+          <w:tab w:val="num" w:pos="720"/>
+        </w:tabs>
+        <w:ind w:left="720" w:hanging="360"/>
+      </w:pPr>
+      <w:rPr>
+        <w:rFonts w:ascii="Symbol" w:hAnsi="Symbol" w:hint="default"/>
+        <w:sz w:val="20"/>
+      </w:rPr>
+    </w:lvl>
+    <w:lvl w:ilvl="1" w:tentative="1">
+      <w:start w:val="1"/>
+      <w:numFmt w:val="bullet"/>
+      <w:lvlText w:val="o"/>
+      <w:lvlJc w:val="left"/>
+      <w:pPr>
+        <w:tabs>
+          <w:tab w:val="num" w:pos="1440"/>
+        </w:tabs>
+        <w:ind w:left="1440" w:hanging="360"/>
+      </w:pPr>
+      <w:rPr>
+        <w:rFonts w:ascii="Courier New" w:hAnsi="Courier New" w:hint="default"/>
+        <w:sz w:val="20"/>
+      </w:rPr>
+    </w:lvl>
+    <w:lvl w:ilvl="2" w:tentative="1">
+      <w:start w:val="1"/>
+      <w:numFmt w:val="bullet"/>
+      <w:lvlText w:val=""/>
+      <w:lvlJc w:val="left"/>
+      <w:pPr>
+        <w:tabs>
+          <w:tab w:val="num" w:pos="2160"/>
+        </w:tabs>
+        <w:ind w:left="2160" w:hanging="360"/>
+      </w:pPr>
+      <w:rPr>
+        <w:rFonts w:ascii="Wingdings" w:hAnsi="Wingdings" w:hint="default"/>
+        <w:sz w:val="20"/>
+      </w:rPr>
+    </w:lvl>
+    <w:lvl w:ilvl="3" w:tentative="1">
+      <w:start w:val="1"/>
+      <w:numFmt w:val="bullet"/>
+      <w:lvlText w:val=""/>
+      <w:lvlJc w:val="left"/>
+      <w:pPr>
+        <w:tabs>
+          <w:tab w:val="num" w:pos="2880"/>
+        </w:tabs>
+        <w:ind w:left="2880" w:hanging="360"/>
+      </w:pPr>
+      <w:rPr>
+        <w:rFonts w:ascii="Wingdings" w:hAnsi="Wingdings" w:hint="default"/>
+        <w:sz w:val="20"/>
+      </w:rPr>
+    </w:lvl>
+    <w:lvl w:ilvl="4" w:tentative="1">
+      <w:start w:val="1"/>
+      <w:numFmt w:val="bullet"/>
+      <w:lvlText w:val=""/>
+      <w:lvlJc w:val="left"/>
+      <w:pPr>
+        <w:tabs>
+          <w:tab w:val="num" w:pos="3600"/>
+        </w:tabs>
+        <w:ind w:left="3600" w:hanging="360"/>
+      </w:pPr>
+      <w:rPr>
+        <w:rFonts w:ascii="Wingdings" w:hAnsi="Wingdings" w:hint="default"/>
+        <w:sz w:val="20"/>
+      </w:rPr>
+    </w:lvl>
+    <w:lvl w:ilvl="5" w:tentative="1">
+      <w:start w:val="1"/>
+      <w:numFmt w:val="bullet"/>
+      <w:lvlText w:val=""/>
+      <w:lvlJc w:val="left"/>
+      <w:pPr>
+        <w:tabs>
+          <w:tab w:val="num" w:pos="4320"/>
+        </w:tabs>
+        <w:ind w:left="4320" w:hanging="360"/>
+      </w:pPr>
+      <w:rPr>
+        <w:rFonts w:ascii="Wingdings" w:hAnsi="Wingdings" w:hint="default"/>
+        <w:sz w:val="20"/>
+      </w:rPr>
+    </w:lvl>
+    <w:lvl w:ilvl="6" w:tentative="1">
+      <w:start w:val="1"/>
+      <w:numFmt w:val="bullet"/>
+      <w:lvlText w:val=""/>
+      <w:lvlJc w:val="left"/>
+      <w:pPr>
+        <w:tabs>
+          <w:tab w:val="num" w:pos="5040"/>
+        </w:tabs>
+        <w:ind w:left="5040" w:hanging="360"/>
+      </w:pPr>
+      <w:rPr>
+        <w:rFonts w:ascii="Wingdings" w:hAnsi="Wingdings" w:hint="default"/>
+        <w:sz w:val="20"/>
+      </w:rPr>
+    </w:lvl>
+    <w:lvl w:ilvl="7" w:tentative="1">
+      <w:start w:val="1"/>
+      <w:numFmt w:val="bullet"/>
+      <w:lvlText w:val=""/>
+      <w:lvlJc w:val="left"/>
+      <w:pPr>
+        <w:tabs>
+          <w:tab w:val="num" w:pos="5760"/>
+        </w:tabs>
+        <w:ind w:left="5760" w:hanging="360"/>
+      </w:pPr>
+      <w:rPr>
+        <w:rFonts w:ascii="Wingdings" w:hAnsi="Wingdings" w:hint="default"/>
+        <w:sz w:val="20"/>
+      </w:rPr>
+    </w:lvl>
+    <w:lvl w:ilvl="8" w:tentative="1">
+      <w:start w:val="1"/>
+      <w:numFmt w:val="bullet"/>
+      <w:lvlText w:val=""/>
+      <w:lvlJc w:val="left"/>
+      <w:pPr>
+        <w:tabs>
+          <w:tab w:val="num" w:pos="6480"/>
+        </w:tabs>
+        <w:ind w:left="6480" w:hanging="360"/>
+      </w:pPr>
+      <w:rPr>
+        <w:rFonts w:ascii="Wingdings" w:hAnsi="Wingdings" w:hint="default"/>
+        <w:sz w:val="20"/>
+      </w:rPr>
+    </w:lvl>
+  </w:abstractNum>
+  <w:abstractNum w:abstractNumId="6" w15:restartNumberingAfterBreak="0">
     <w:nsid w:val="1C563564"/>
     <w:multiLevelType w:val="hybridMultilevel"/>
     <w:tmpl w:val="FBA47562"/>
@@ -2129,7 +3060,7 @@
       </w:rPr>
     </w:lvl>
   </w:abstractNum>
-  <w:abstractNum w:abstractNumId="6" w15:restartNumberingAfterBreak="0">
+  <w:abstractNum w:abstractNumId="7" w15:restartNumberingAfterBreak="0">
     <w:nsid w:val="1D2831E0"/>
     <w:multiLevelType w:val="multilevel"/>
     <w:tmpl w:val="25404E44"/>
@@ -2278,7 +3209,7 @@
       </w:rPr>
     </w:lvl>
   </w:abstractNum>
-  <w:abstractNum w:abstractNumId="7" w15:restartNumberingAfterBreak="0">
+  <w:abstractNum w:abstractNumId="8" w15:restartNumberingAfterBreak="0">
     <w:nsid w:val="2A780804"/>
     <w:multiLevelType w:val="multilevel"/>
     <w:tmpl w:val="625A7FA0"/>
@@ -2427,7 +3358,120 @@
       </w:rPr>
     </w:lvl>
   </w:abstractNum>
-  <w:abstractNum w:abstractNumId="8" w15:restartNumberingAfterBreak="0">
+  <w:abstractNum w:abstractNumId="9" w15:restartNumberingAfterBreak="0">
+    <w:nsid w:val="4A6C5C8B"/>
+    <w:multiLevelType w:val="hybridMultilevel"/>
+    <w:tmpl w:val="F19A6502"/>
+    <w:lvl w:ilvl="0" w:tplc="0C090001">
+      <w:start w:val="1"/>
+      <w:numFmt w:val="bullet"/>
+      <w:lvlText w:val=""/>
+      <w:lvlJc w:val="left"/>
+      <w:pPr>
+        <w:ind w:left="720" w:hanging="360"/>
+      </w:pPr>
+      <w:rPr>
+        <w:rFonts w:ascii="Symbol" w:hAnsi="Symbol" w:hint="default"/>
+      </w:rPr>
+    </w:lvl>
+    <w:lvl w:ilvl="1" w:tplc="0C090003" w:tentative="1">
+      <w:start w:val="1"/>
+      <w:numFmt w:val="bullet"/>
+      <w:lvlText w:val="o"/>
+      <w:lvlJc w:val="left"/>
+      <w:pPr>
+        <w:ind w:left="1440" w:hanging="360"/>
+      </w:pPr>
+      <w:rPr>
+        <w:rFonts w:ascii="Courier New" w:hAnsi="Courier New" w:cs="Courier New" w:hint="default"/>
+      </w:rPr>
+    </w:lvl>
+    <w:lvl w:ilvl="2" w:tplc="0C090005" w:tentative="1">
+      <w:start w:val="1"/>
+      <w:numFmt w:val="bullet"/>
+      <w:lvlText w:val=""/>
+      <w:lvlJc w:val="left"/>
+      <w:pPr>
+        <w:ind w:left="2160" w:hanging="360"/>
+      </w:pPr>
+      <w:rPr>
+        <w:rFonts w:ascii="Wingdings" w:hAnsi="Wingdings" w:hint="default"/>
+      </w:rPr>
+    </w:lvl>
+    <w:lvl w:ilvl="3" w:tplc="0C090001" w:tentative="1">
+      <w:start w:val="1"/>
+      <w:numFmt w:val="bullet"/>
+      <w:lvlText w:val=""/>
+      <w:lvlJc w:val="left"/>
+      <w:pPr>
+        <w:ind w:left="2880" w:hanging="360"/>
+      </w:pPr>
+      <w:rPr>
+        <w:rFonts w:ascii="Symbol" w:hAnsi="Symbol" w:hint="default"/>
+      </w:rPr>
+    </w:lvl>
+    <w:lvl w:ilvl="4" w:tplc="0C090003" w:tentative="1">
+      <w:start w:val="1"/>
+      <w:numFmt w:val="bullet"/>
+      <w:lvlText w:val="o"/>
+      <w:lvlJc w:val="left"/>
+      <w:pPr>
+        <w:ind w:left="3600" w:hanging="360"/>
+      </w:pPr>
+      <w:rPr>
+        <w:rFonts w:ascii="Courier New" w:hAnsi="Courier New" w:cs="Courier New" w:hint="default"/>
+      </w:rPr>
+    </w:lvl>
+    <w:lvl w:ilvl="5" w:tplc="0C090005" w:tentative="1">
+      <w:start w:val="1"/>
+      <w:numFmt w:val="bullet"/>
+      <w:lvlText w:val=""/>
+      <w:lvlJc w:val="left"/>
+      <w:pPr>
+        <w:ind w:left="4320" w:hanging="360"/>
+      </w:pPr>
+      <w:rPr>
+        <w:rFonts w:ascii="Wingdings" w:hAnsi="Wingdings" w:hint="default"/>
+      </w:rPr>
+    </w:lvl>
+    <w:lvl w:ilvl="6" w:tplc="0C090001" w:tentative="1">
+      <w:start w:val="1"/>
+      <w:numFmt w:val="bullet"/>
+      <w:lvlText w:val=""/>
+      <w:lvlJc w:val="left"/>
+      <w:pPr>
+        <w:ind w:left="5040" w:hanging="360"/>
+      </w:pPr>
+      <w:rPr>
+        <w:rFonts w:ascii="Symbol" w:hAnsi="Symbol" w:hint="default"/>
+      </w:rPr>
+    </w:lvl>
+    <w:lvl w:ilvl="7" w:tplc="0C090003" w:tentative="1">
+      <w:start w:val="1"/>
+      <w:numFmt w:val="bullet"/>
+      <w:lvlText w:val="o"/>
+      <w:lvlJc w:val="left"/>
+      <w:pPr>
+        <w:ind w:left="5760" w:hanging="360"/>
+      </w:pPr>
+      <w:rPr>
+        <w:rFonts w:ascii="Courier New" w:hAnsi="Courier New" w:cs="Courier New" w:hint="default"/>
+      </w:rPr>
+    </w:lvl>
+    <w:lvl w:ilvl="8" w:tplc="0C090005" w:tentative="1">
+      <w:start w:val="1"/>
+      <w:numFmt w:val="bullet"/>
+      <w:lvlText w:val=""/>
+      <w:lvlJc w:val="left"/>
+      <w:pPr>
+        <w:ind w:left="6480" w:hanging="360"/>
+      </w:pPr>
+      <w:rPr>
+        <w:rFonts w:ascii="Wingdings" w:hAnsi="Wingdings" w:hint="default"/>
+      </w:rPr>
+    </w:lvl>
+  </w:abstractNum>
+  <w:abstractNum w:abstractNumId="10" w15:restartNumberingAfterBreak="0">
     <w:nsid w:val="4B46062B"/>
     <w:multiLevelType w:val="multilevel"/>
     <w:tmpl w:val="861EBA68"/>
@@ -2576,7 +3620,7 @@
       </w:rPr>
     </w:lvl>
   </w:abstractNum>
-  <w:abstractNum w:abstractNumId="9" w15:restartNumberingAfterBreak="0">
+  <w:abstractNum w:abstractNumId="11" w15:restartNumberingAfterBreak="0">
     <w:nsid w:val="4E3A5B98"/>
     <w:multiLevelType w:val="multilevel"/>
     <w:tmpl w:val="531A99BC"/>
@@ -2725,7 +3769,7 @@
       </w:rPr>
     </w:lvl>
   </w:abstractNum>
-  <w:abstractNum w:abstractNumId="10" w15:restartNumberingAfterBreak="0">
+  <w:abstractNum w:abstractNumId="12" w15:restartNumberingAfterBreak="0">
     <w:nsid w:val="50A75860"/>
     <w:multiLevelType w:val="multilevel"/>
     <w:tmpl w:val="69BAA0D2"/>
@@ -2874,7 +3918,7 @@
       </w:rPr>
     </w:lvl>
   </w:abstractNum>
-  <w:abstractNum w:abstractNumId="11" w15:restartNumberingAfterBreak="0">
+  <w:abstractNum w:abstractNumId="13" w15:restartNumberingAfterBreak="0">
     <w:nsid w:val="52875A3B"/>
     <w:multiLevelType w:val="multilevel"/>
     <w:tmpl w:val="ACF4A2A8"/>
@@ -3023,7 +4067,7 @@
       </w:rPr>
     </w:lvl>
   </w:abstractNum>
-  <w:abstractNum w:abstractNumId="12" w15:restartNumberingAfterBreak="0">
+  <w:abstractNum w:abstractNumId="14" w15:restartNumberingAfterBreak="0">
     <w:nsid w:val="5D4D0EC7"/>
     <w:multiLevelType w:val="multilevel"/>
     <w:tmpl w:val="19B241C2"/>
@@ -3172,7 +4216,7 @@
       </w:rPr>
     </w:lvl>
   </w:abstractNum>
-  <w:abstractNum w:abstractNumId="13" w15:restartNumberingAfterBreak="0">
+  <w:abstractNum w:abstractNumId="15" w15:restartNumberingAfterBreak="0">
     <w:nsid w:val="643761F2"/>
     <w:multiLevelType w:val="hybridMultilevel"/>
     <w:tmpl w:val="87902146"/>
@@ -3285,7 +4329,233 @@
       </w:rPr>
     </w:lvl>
   </w:abstractNum>
-  <w:abstractNum w:abstractNumId="14" w15:restartNumberingAfterBreak="0">
+  <w:abstractNum w:abstractNumId="16" w15:restartNumberingAfterBreak="0">
+    <w:nsid w:val="670F04C1"/>
+    <w:multiLevelType w:val="hybridMultilevel"/>
+    <w:tmpl w:val="046E6974"/>
+    <w:lvl w:ilvl="0" w:tplc="0C090001">
+      <w:start w:val="1"/>
+      <w:numFmt w:val="bullet"/>
+      <w:lvlText w:val=""/>
+      <w:lvlJc w:val="left"/>
+      <w:pPr>
+        <w:ind w:left="720" w:hanging="360"/>
+      </w:pPr>
+      <w:rPr>
+        <w:rFonts w:ascii="Symbol" w:hAnsi="Symbol" w:hint="default"/>
+      </w:rPr>
+    </w:lvl>
+    <w:lvl w:ilvl="1" w:tplc="0C090003" w:tentative="1">
+      <w:start w:val="1"/>
+      <w:numFmt w:val="bullet"/>
+      <w:lvlText w:val="o"/>
+      <w:lvlJc w:val="left"/>
+      <w:pPr>
+        <w:ind w:left="1440" w:hanging="360"/>
+      </w:pPr>
+      <w:rPr>
+        <w:rFonts w:ascii="Courier New" w:hAnsi="Courier New" w:cs="Courier New" w:hint="default"/>
+      </w:rPr>
+    </w:lvl>
+    <w:lvl w:ilvl="2" w:tplc="0C090005" w:tentative="1">
+      <w:start w:val="1"/>
+      <w:numFmt w:val="bullet"/>
+      <w:lvlText w:val=""/>
+      <w:lvlJc w:val="left"/>
+      <w:pPr>
+        <w:ind w:left="2160" w:hanging="360"/>
+      </w:pPr>
+      <w:rPr>
+        <w:rFonts w:ascii="Wingdings" w:hAnsi="Wingdings" w:hint="default"/>
+      </w:rPr>
+    </w:lvl>
+    <w:lvl w:ilvl="3" w:tplc="0C090001" w:tentative="1">
+      <w:start w:val="1"/>
+      <w:numFmt w:val="bullet"/>
+      <w:lvlText w:val=""/>
+      <w:lvlJc w:val="left"/>
+      <w:pPr>
+        <w:ind w:left="2880" w:hanging="360"/>
+      </w:pPr>
+      <w:rPr>
+        <w:rFonts w:ascii="Symbol" w:hAnsi="Symbol" w:hint="default"/>
+      </w:rPr>
+    </w:lvl>
+    <w:lvl w:ilvl="4" w:tplc="0C090003" w:tentative="1">
+      <w:start w:val="1"/>
+      <w:numFmt w:val="bullet"/>
+      <w:lvlText w:val="o"/>
+      <w:lvlJc w:val="left"/>
+      <w:pPr>
+        <w:ind w:left="3600" w:hanging="360"/>
+      </w:pPr>
+      <w:rPr>
+        <w:rFonts w:ascii="Courier New" w:hAnsi="Courier New" w:cs="Courier New" w:hint="default"/>
+      </w:rPr>
+    </w:lvl>
+    <w:lvl w:ilvl="5" w:tplc="0C090005" w:tentative="1">
+      <w:start w:val="1"/>
+      <w:numFmt w:val="bullet"/>
+      <w:lvlText w:val=""/>
+      <w:lvlJc w:val="left"/>
+      <w:pPr>
+        <w:ind w:left="4320" w:hanging="360"/>
+      </w:pPr>
+      <w:rPr>
+        <w:rFonts w:ascii="Wingdings" w:hAnsi="Wingdings" w:hint="default"/>
+      </w:rPr>
+    </w:lvl>
+    <w:lvl w:ilvl="6" w:tplc="0C090001" w:tentative="1">
+      <w:start w:val="1"/>
+      <w:numFmt w:val="bullet"/>
+      <w:lvlText w:val=""/>
+      <w:lvlJc w:val="left"/>
+      <w:pPr>
+        <w:ind w:left="5040" w:hanging="360"/>
+      </w:pPr>
+      <w:rPr>
+        <w:rFonts w:ascii="Symbol" w:hAnsi="Symbol" w:hint="default"/>
+      </w:rPr>
+    </w:lvl>
+    <w:lvl w:ilvl="7" w:tplc="0C090003" w:tentative="1">
+      <w:start w:val="1"/>
+      <w:numFmt w:val="bullet"/>
+      <w:lvlText w:val="o"/>
+      <w:lvlJc w:val="left"/>
+      <w:pPr>
+        <w:ind w:left="5760" w:hanging="360"/>
+      </w:pPr>
+      <w:rPr>
+        <w:rFonts w:ascii="Courier New" w:hAnsi="Courier New" w:cs="Courier New" w:hint="default"/>
+      </w:rPr>
+    </w:lvl>
+    <w:lvl w:ilvl="8" w:tplc="0C090005" w:tentative="1">
+      <w:start w:val="1"/>
+      <w:numFmt w:val="bullet"/>
+      <w:lvlText w:val=""/>
+      <w:lvlJc w:val="left"/>
+      <w:pPr>
+        <w:ind w:left="6480" w:hanging="360"/>
+      </w:pPr>
+      <w:rPr>
+        <w:rFonts w:ascii="Wingdings" w:hAnsi="Wingdings" w:hint="default"/>
+      </w:rPr>
+    </w:lvl>
+  </w:abstractNum>
+  <w:abstractNum w:abstractNumId="17" w15:restartNumberingAfterBreak="0">
+    <w:nsid w:val="6A050D00"/>
+    <w:multiLevelType w:val="hybridMultilevel"/>
+    <w:tmpl w:val="E71CBB4E"/>
+    <w:lvl w:ilvl="0" w:tplc="0C090001">
+      <w:start w:val="1"/>
+      <w:numFmt w:val="bullet"/>
+      <w:lvlText w:val=""/>
+      <w:lvlJc w:val="left"/>
+      <w:pPr>
+        <w:ind w:left="720" w:hanging="360"/>
+      </w:pPr>
+      <w:rPr>
+        <w:rFonts w:ascii="Symbol" w:hAnsi="Symbol" w:hint="default"/>
+      </w:rPr>
+    </w:lvl>
+    <w:lvl w:ilvl="1" w:tplc="0C090003">
+      <w:start w:val="1"/>
+      <w:numFmt w:val="bullet"/>
+      <w:lvlText w:val="o"/>
+      <w:lvlJc w:val="left"/>
+      <w:pPr>
+        <w:ind w:left="1440" w:hanging="360"/>
+      </w:pPr>
+      <w:rPr>
+        <w:rFonts w:ascii="Courier New" w:hAnsi="Courier New" w:cs="Courier New" w:hint="default"/>
+      </w:rPr>
+    </w:lvl>
+    <w:lvl w:ilvl="2" w:tplc="0C090005" w:tentative="1">
+      <w:start w:val="1"/>
+      <w:numFmt w:val="bullet"/>
+      <w:lvlText w:val=""/>
+      <w:lvlJc w:val="left"/>
+      <w:pPr>
+        <w:ind w:left="2160" w:hanging="360"/>
+      </w:pPr>
+      <w:rPr>
+        <w:rFonts w:ascii="Wingdings" w:hAnsi="Wingdings" w:hint="default"/>
+      </w:rPr>
+    </w:lvl>
+    <w:lvl w:ilvl="3" w:tplc="0C090001" w:tentative="1">
+      <w:start w:val="1"/>
+      <w:numFmt w:val="bullet"/>
+      <w:lvlText w:val=""/>
+      <w:lvlJc w:val="left"/>
+      <w:pPr>
+        <w:ind w:left="2880" w:hanging="360"/>
+      </w:pPr>
+      <w:rPr>
+        <w:rFonts w:ascii="Symbol" w:hAnsi="Symbol" w:hint="default"/>
+      </w:rPr>
+    </w:lvl>
+    <w:lvl w:ilvl="4" w:tplc="0C090003" w:tentative="1">
+      <w:start w:val="1"/>
+      <w:numFmt w:val="bullet"/>
+      <w:lvlText w:val="o"/>
+      <w:lvlJc w:val="left"/>
+      <w:pPr>
+        <w:ind w:left="3600" w:hanging="360"/>
+      </w:pPr>
+      <w:rPr>
+        <w:rFonts w:ascii="Courier New" w:hAnsi="Courier New" w:cs="Courier New" w:hint="default"/>
+      </w:rPr>
+    </w:lvl>
+    <w:lvl w:ilvl="5" w:tplc="0C090005" w:tentative="1">
+      <w:start w:val="1"/>
+      <w:numFmt w:val="bullet"/>
+      <w:lvlText w:val=""/>
+      <w:lvlJc w:val="left"/>
+      <w:pPr>
+        <w:ind w:left="4320" w:hanging="360"/>
+      </w:pPr>
+      <w:rPr>
+        <w:rFonts w:ascii="Wingdings" w:hAnsi="Wingdings" w:hint="default"/>
+      </w:rPr>
+    </w:lvl>
+    <w:lvl w:ilvl="6" w:tplc="0C090001" w:tentative="1">
+      <w:start w:val="1"/>
+      <w:numFmt w:val="bullet"/>
+      <w:lvlText w:val=""/>
+      <w:lvlJc w:val="left"/>
+      <w:pPr>
+        <w:ind w:left="5040" w:hanging="360"/>
+      </w:pPr>
+      <w:rPr>
+        <w:rFonts w:ascii="Symbol" w:hAnsi="Symbol" w:hint="default"/>
+      </w:rPr>
+    </w:lvl>
+    <w:lvl w:ilvl="7" w:tplc="0C090003" w:tentative="1">
+      <w:start w:val="1"/>
+      <w:numFmt w:val="bullet"/>
+      <w:lvlText w:val="o"/>
+      <w:lvlJc w:val="left"/>
+      <w:pPr>
+        <w:ind w:left="5760" w:hanging="360"/>
+      </w:pPr>
+      <w:rPr>
+        <w:rFonts w:ascii="Courier New" w:hAnsi="Courier New" w:cs="Courier New" w:hint="default"/>
+      </w:rPr>
+    </w:lvl>
+    <w:lvl w:ilvl="8" w:tplc="0C090005" w:tentative="1">
+      <w:start w:val="1"/>
+      <w:numFmt w:val="bullet"/>
+      <w:lvlText w:val=""/>
+      <w:lvlJc w:val="left"/>
+      <w:pPr>
+        <w:ind w:left="6480" w:hanging="360"/>
+      </w:pPr>
+      <w:rPr>
+        <w:rFonts w:ascii="Wingdings" w:hAnsi="Wingdings" w:hint="default"/>
+      </w:rPr>
+    </w:lvl>
+  </w:abstractNum>
+  <w:abstractNum w:abstractNumId="18" w15:restartNumberingAfterBreak="0">
     <w:nsid w:val="6B9B6DEE"/>
     <w:multiLevelType w:val="multilevel"/>
     <w:tmpl w:val="14AA1448"/>
@@ -3434,10 +4704,10 @@
       </w:rPr>
     </w:lvl>
   </w:abstractNum>
-  <w:abstractNum w:abstractNumId="15" w15:restartNumberingAfterBreak="0">
+  <w:abstractNum w:abstractNumId="19" w15:restartNumberingAfterBreak="0">
     <w:nsid w:val="771C30B3"/>
     <w:multiLevelType w:val="hybridMultilevel"/>
-    <w:tmpl w:val="DD3033E4"/>
+    <w:tmpl w:val="7790685A"/>
     <w:lvl w:ilvl="0" w:tplc="0C090001">
       <w:start w:val="1"/>
       <w:numFmt w:val="bullet"/>
@@ -3475,6 +4745,119 @@
       </w:rPr>
     </w:lvl>
     <w:lvl w:ilvl="3" w:tplc="0C090001">
+      <w:start w:val="1"/>
+      <w:numFmt w:val="bullet"/>
+      <w:lvlText w:val=""/>
+      <w:lvlJc w:val="left"/>
+      <w:pPr>
+        <w:ind w:left="2880" w:hanging="360"/>
+      </w:pPr>
+      <w:rPr>
+        <w:rFonts w:ascii="Symbol" w:hAnsi="Symbol" w:hint="default"/>
+      </w:rPr>
+    </w:lvl>
+    <w:lvl w:ilvl="4" w:tplc="0C090003" w:tentative="1">
+      <w:start w:val="1"/>
+      <w:numFmt w:val="bullet"/>
+      <w:lvlText w:val="o"/>
+      <w:lvlJc w:val="left"/>
+      <w:pPr>
+        <w:ind w:left="3600" w:hanging="360"/>
+      </w:pPr>
+      <w:rPr>
+        <w:rFonts w:ascii="Courier New" w:hAnsi="Courier New" w:cs="Courier New" w:hint="default"/>
+      </w:rPr>
+    </w:lvl>
+    <w:lvl w:ilvl="5" w:tplc="0C090005" w:tentative="1">
+      <w:start w:val="1"/>
+      <w:numFmt w:val="bullet"/>
+      <w:lvlText w:val=""/>
+      <w:lvlJc w:val="left"/>
+      <w:pPr>
+        <w:ind w:left="4320" w:hanging="360"/>
+      </w:pPr>
+      <w:rPr>
+        <w:rFonts w:ascii="Wingdings" w:hAnsi="Wingdings" w:hint="default"/>
+      </w:rPr>
+    </w:lvl>
+    <w:lvl w:ilvl="6" w:tplc="0C090001" w:tentative="1">
+      <w:start w:val="1"/>
+      <w:numFmt w:val="bullet"/>
+      <w:lvlText w:val=""/>
+      <w:lvlJc w:val="left"/>
+      <w:pPr>
+        <w:ind w:left="5040" w:hanging="360"/>
+      </w:pPr>
+      <w:rPr>
+        <w:rFonts w:ascii="Symbol" w:hAnsi="Symbol" w:hint="default"/>
+      </w:rPr>
+    </w:lvl>
+    <w:lvl w:ilvl="7" w:tplc="0C090003" w:tentative="1">
+      <w:start w:val="1"/>
+      <w:numFmt w:val="bullet"/>
+      <w:lvlText w:val="o"/>
+      <w:lvlJc w:val="left"/>
+      <w:pPr>
+        <w:ind w:left="5760" w:hanging="360"/>
+      </w:pPr>
+      <w:rPr>
+        <w:rFonts w:ascii="Courier New" w:hAnsi="Courier New" w:cs="Courier New" w:hint="default"/>
+      </w:rPr>
+    </w:lvl>
+    <w:lvl w:ilvl="8" w:tplc="0C090005" w:tentative="1">
+      <w:start w:val="1"/>
+      <w:numFmt w:val="bullet"/>
+      <w:lvlText w:val=""/>
+      <w:lvlJc w:val="left"/>
+      <w:pPr>
+        <w:ind w:left="6480" w:hanging="360"/>
+      </w:pPr>
+      <w:rPr>
+        <w:rFonts w:ascii="Wingdings" w:hAnsi="Wingdings" w:hint="default"/>
+      </w:rPr>
+    </w:lvl>
+  </w:abstractNum>
+  <w:abstractNum w:abstractNumId="20" w15:restartNumberingAfterBreak="0">
+    <w:nsid w:val="7B8D15E8"/>
+    <w:multiLevelType w:val="hybridMultilevel"/>
+    <w:tmpl w:val="2F843AF6"/>
+    <w:lvl w:ilvl="0" w:tplc="0C090001">
+      <w:start w:val="1"/>
+      <w:numFmt w:val="bullet"/>
+      <w:lvlText w:val=""/>
+      <w:lvlJc w:val="left"/>
+      <w:pPr>
+        <w:ind w:left="720" w:hanging="360"/>
+      </w:pPr>
+      <w:rPr>
+        <w:rFonts w:ascii="Symbol" w:hAnsi="Symbol" w:hint="default"/>
+      </w:rPr>
+    </w:lvl>
+    <w:lvl w:ilvl="1" w:tplc="0C090003" w:tentative="1">
+      <w:start w:val="1"/>
+      <w:numFmt w:val="bullet"/>
+      <w:lvlText w:val="o"/>
+      <w:lvlJc w:val="left"/>
+      <w:pPr>
+        <w:ind w:left="1440" w:hanging="360"/>
+      </w:pPr>
+      <w:rPr>
+        <w:rFonts w:ascii="Courier New" w:hAnsi="Courier New" w:cs="Courier New" w:hint="default"/>
+      </w:rPr>
+    </w:lvl>
+    <w:lvl w:ilvl="2" w:tplc="0C090005" w:tentative="1">
+      <w:start w:val="1"/>
+      <w:numFmt w:val="bullet"/>
+      <w:lvlText w:val=""/>
+      <w:lvlJc w:val="left"/>
+      <w:pPr>
+        <w:ind w:left="2160" w:hanging="360"/>
+      </w:pPr>
+      <w:rPr>
+        <w:rFonts w:ascii="Wingdings" w:hAnsi="Wingdings" w:hint="default"/>
+      </w:rPr>
+    </w:lvl>
+    <w:lvl w:ilvl="3" w:tplc="0C090001" w:tentative="1">
       <w:start w:val="1"/>
       <w:numFmt w:val="bullet"/>
       <w:lvlText w:val=""/>
@@ -3548,34 +4931,34 @@
     </w:lvl>
   </w:abstractNum>
   <w:num w:numId="1" w16cid:durableId="1263879209">
-    <w:abstractNumId w:val="11"/>
+    <w:abstractNumId w:val="13"/>
   </w:num>
   <w:num w:numId="2" w16cid:durableId="1182236525">
-    <w:abstractNumId w:val="7"/>
+    <w:abstractNumId w:val="8"/>
   </w:num>
   <w:num w:numId="3" w16cid:durableId="85157640">
-    <w:abstractNumId w:val="12"/>
+    <w:abstractNumId w:val="14"/>
   </w:num>
   <w:num w:numId="4" w16cid:durableId="1002662983">
-    <w:abstractNumId w:val="14"/>
+    <w:abstractNumId w:val="18"/>
   </w:num>
   <w:num w:numId="5" w16cid:durableId="1895239434">
-    <w:abstractNumId w:val="6"/>
+    <w:abstractNumId w:val="7"/>
   </w:num>
   <w:num w:numId="6" w16cid:durableId="888957048">
     <w:abstractNumId w:val="4"/>
   </w:num>
   <w:num w:numId="7" w16cid:durableId="1791165771">
-    <w:abstractNumId w:val="8"/>
+    <w:abstractNumId w:val="10"/>
   </w:num>
   <w:num w:numId="8" w16cid:durableId="739327547">
-    <w:abstractNumId w:val="9"/>
+    <w:abstractNumId w:val="11"/>
   </w:num>
   <w:num w:numId="9" w16cid:durableId="460421743">
     <w:abstractNumId w:val="3"/>
   </w:num>
   <w:num w:numId="10" w16cid:durableId="36515982">
-    <w:abstractNumId w:val="10"/>
+    <w:abstractNumId w:val="12"/>
   </w:num>
   <w:num w:numId="11" w16cid:durableId="426998091">
     <w:abstractNumId w:val="0"/>
@@ -3584,16 +4967,31 @@
     <w:abstractNumId w:val="1"/>
   </w:num>
   <w:num w:numId="13" w16cid:durableId="2057123923">
-    <w:abstractNumId w:val="15"/>
+    <w:abstractNumId w:val="19"/>
   </w:num>
   <w:num w:numId="14" w16cid:durableId="1872723653">
-    <w:abstractNumId w:val="5"/>
+    <w:abstractNumId w:val="6"/>
   </w:num>
   <w:num w:numId="15" w16cid:durableId="1603684609">
     <w:abstractNumId w:val="2"/>
   </w:num>
   <w:num w:numId="16" w16cid:durableId="1957592101">
-    <w:abstractNumId w:val="13"/>
+    <w:abstractNumId w:val="15"/>
+  </w:num>
+  <w:num w:numId="17" w16cid:durableId="1842038286">
+    <w:abstractNumId w:val="5"/>
+  </w:num>
+  <w:num w:numId="18" w16cid:durableId="1848980121">
+    <w:abstractNumId w:val="16"/>
+  </w:num>
+  <w:num w:numId="19" w16cid:durableId="78598795">
+    <w:abstractNumId w:val="17"/>
+  </w:num>
+  <w:num w:numId="20" w16cid:durableId="1475221590">
+    <w:abstractNumId w:val="9"/>
+  </w:num>
+  <w:num w:numId="21" w16cid:durableId="1533375498">
+    <w:abstractNumId w:val="20"/>
   </w:num>
 </w:numbering>
 </file>

</xml_diff>